<commit_message>
hoan thanh cac cau hoi
</commit_message>
<xml_diff>
--- a/HoangHung_Git_Stash.docx
+++ b/HoangHung_Git_Stash.docx
@@ -22,47 +22,7 @@
           <w:sz w:val="24"/>
           <w:szCs w:val="24"/>
         </w:rPr>
-        <w:t xml:space="preserve">Các </w:t>
-      </w:r>
-      <w:proofErr w:type="spellStart"/>
-      <w:r>
-        <w:rPr>
-          <w:rStyle w:val="HTMLCode"/>
-          <w:rFonts w:ascii="Times New Roman" w:hAnsi="Times New Roman" w:cs="Times New Roman"/>
-          <w:sz w:val="24"/>
-          <w:szCs w:val="24"/>
-        </w:rPr>
-        <w:t>câu</w:t>
-      </w:r>
-      <w:proofErr w:type="spellEnd"/>
-      <w:r>
-        <w:rPr>
-          <w:rStyle w:val="HTMLCode"/>
-          <w:rFonts w:ascii="Times New Roman" w:hAnsi="Times New Roman" w:cs="Times New Roman"/>
-          <w:sz w:val="24"/>
-          <w:szCs w:val="24"/>
-        </w:rPr>
-        <w:t xml:space="preserve"> </w:t>
-      </w:r>
-      <w:proofErr w:type="spellStart"/>
-      <w:r>
-        <w:rPr>
-          <w:rStyle w:val="HTMLCode"/>
-          <w:rFonts w:ascii="Times New Roman" w:hAnsi="Times New Roman" w:cs="Times New Roman"/>
-          <w:sz w:val="24"/>
-          <w:szCs w:val="24"/>
-        </w:rPr>
-        <w:t>lệnh</w:t>
-      </w:r>
-      <w:proofErr w:type="spellEnd"/>
-      <w:r>
-        <w:rPr>
-          <w:rStyle w:val="HTMLCode"/>
-          <w:rFonts w:ascii="Times New Roman" w:hAnsi="Times New Roman" w:cs="Times New Roman"/>
-          <w:sz w:val="24"/>
-          <w:szCs w:val="24"/>
-        </w:rPr>
-        <w:t xml:space="preserve"> git stash</w:t>
+        <w:t>Các câu lệnh git stash</w:t>
       </w:r>
     </w:p>
     <w:p>
@@ -90,25 +50,7 @@
           <w:b w:val="0"/>
           <w:bCs w:val="0"/>
         </w:rPr>
-        <w:t xml:space="preserve"> (</w:t>
-      </w:r>
-      <w:proofErr w:type="spellStart"/>
-      <w:r>
-        <w:rPr>
-          <w:rStyle w:val="Strong"/>
-          <w:b w:val="0"/>
-          <w:bCs w:val="0"/>
-        </w:rPr>
-        <w:t>hoặc</w:t>
-      </w:r>
-      <w:proofErr w:type="spellEnd"/>
-      <w:r>
-        <w:rPr>
-          <w:rStyle w:val="Strong"/>
-          <w:b w:val="0"/>
-          <w:bCs w:val="0"/>
-        </w:rPr>
-        <w:t xml:space="preserve"> </w:t>
+        <w:t xml:space="preserve"> (hoặc </w:t>
       </w:r>
       <w:r>
         <w:rPr>
@@ -141,85 +83,8 @@
       <w:pPr>
         <w:pStyle w:val="NormalWeb"/>
       </w:pPr>
-      <w:proofErr w:type="spellStart"/>
-      <w:r>
-        <w:t>Lệnh</w:t>
-      </w:r>
-      <w:proofErr w:type="spellEnd"/>
-      <w:r>
-        <w:t xml:space="preserve"> </w:t>
-      </w:r>
-      <w:proofErr w:type="spellStart"/>
-      <w:r>
-        <w:t>này</w:t>
-      </w:r>
-      <w:proofErr w:type="spellEnd"/>
-      <w:r>
-        <w:t xml:space="preserve"> </w:t>
-      </w:r>
-      <w:proofErr w:type="spellStart"/>
-      <w:r>
-        <w:t>sẽ</w:t>
-      </w:r>
-      <w:proofErr w:type="spellEnd"/>
-      <w:r>
-        <w:t xml:space="preserve"> </w:t>
-      </w:r>
-      <w:proofErr w:type="spellStart"/>
-      <w:r>
-        <w:t>lưu</w:t>
-      </w:r>
-      <w:proofErr w:type="spellEnd"/>
-      <w:r>
-        <w:t xml:space="preserve"> </w:t>
-      </w:r>
-      <w:proofErr w:type="spellStart"/>
-      <w:r>
-        <w:t>lại</w:t>
-      </w:r>
-      <w:proofErr w:type="spellEnd"/>
-      <w:r>
-        <w:t xml:space="preserve"> </w:t>
-      </w:r>
-      <w:proofErr w:type="spellStart"/>
-      <w:r>
-        <w:t>các</w:t>
-      </w:r>
-      <w:proofErr w:type="spellEnd"/>
-      <w:r>
-        <w:t xml:space="preserve"> </w:t>
-      </w:r>
-      <w:proofErr w:type="spellStart"/>
-      <w:r>
-        <w:t>thay</w:t>
-      </w:r>
-      <w:proofErr w:type="spellEnd"/>
-      <w:r>
-        <w:t xml:space="preserve"> </w:t>
-      </w:r>
-      <w:proofErr w:type="spellStart"/>
-      <w:r>
-        <w:t>đổi</w:t>
-      </w:r>
-      <w:proofErr w:type="spellEnd"/>
-      <w:r>
-        <w:t xml:space="preserve"> </w:t>
-      </w:r>
-      <w:proofErr w:type="spellStart"/>
-      <w:r>
-        <w:t>chưa</w:t>
-      </w:r>
-      <w:proofErr w:type="spellEnd"/>
-      <w:r>
-        <w:t xml:space="preserve"> commit </w:t>
-      </w:r>
-      <w:proofErr w:type="spellStart"/>
-      <w:r>
-        <w:t>vào</w:t>
-      </w:r>
-      <w:proofErr w:type="spellEnd"/>
-      <w:r>
-        <w:t xml:space="preserve"> </w:t>
+      <w:r>
+        <w:t xml:space="preserve">Lệnh này sẽ lưu lại các thay đổi chưa commit vào </w:t>
       </w:r>
       <w:r>
         <w:rPr>
@@ -228,55 +93,7 @@
         <w:t>stash</w:t>
       </w:r>
       <w:r>
-        <w:t xml:space="preserve"> </w:t>
-      </w:r>
-      <w:proofErr w:type="spellStart"/>
-      <w:r>
-        <w:t>và</w:t>
-      </w:r>
-      <w:proofErr w:type="spellEnd"/>
-      <w:r>
-        <w:t xml:space="preserve"> quay </w:t>
-      </w:r>
-      <w:proofErr w:type="spellStart"/>
-      <w:r>
-        <w:t>về</w:t>
-      </w:r>
-      <w:proofErr w:type="spellEnd"/>
-      <w:r>
-        <w:t xml:space="preserve"> </w:t>
-      </w:r>
-      <w:proofErr w:type="spellStart"/>
-      <w:r>
-        <w:t>trạng</w:t>
-      </w:r>
-      <w:proofErr w:type="spellEnd"/>
-      <w:r>
-        <w:t xml:space="preserve"> </w:t>
-      </w:r>
-      <w:proofErr w:type="spellStart"/>
-      <w:r>
-        <w:t>thái</w:t>
-      </w:r>
-      <w:proofErr w:type="spellEnd"/>
-      <w:r>
-        <w:t xml:space="preserve"> </w:t>
-      </w:r>
-      <w:proofErr w:type="spellStart"/>
-      <w:r>
-        <w:t>sạch</w:t>
-      </w:r>
-      <w:proofErr w:type="spellEnd"/>
-      <w:r>
-        <w:t xml:space="preserve"> </w:t>
-      </w:r>
-      <w:proofErr w:type="spellStart"/>
-      <w:r>
-        <w:t>của</w:t>
-      </w:r>
-      <w:proofErr w:type="spellEnd"/>
-      <w:r>
-        <w:t xml:space="preserve"> repository.</w:t>
+        <w:t xml:space="preserve"> và quay về trạng thái sạch của repository.</w:t>
       </w:r>
     </w:p>
     <w:p>
@@ -284,141 +101,25 @@
         <w:pStyle w:val="NormalWeb"/>
       </w:pPr>
       <w:r>
-        <w:t xml:space="preserve">Thay </w:t>
-      </w:r>
-      <w:proofErr w:type="spellStart"/>
-      <w:r>
-        <w:t>đổi</w:t>
-      </w:r>
-      <w:proofErr w:type="spellEnd"/>
-      <w:r>
-        <w:t xml:space="preserve"> </w:t>
-      </w:r>
-      <w:proofErr w:type="spellStart"/>
-      <w:r>
-        <w:t>trong</w:t>
-      </w:r>
-      <w:proofErr w:type="spellEnd"/>
-      <w:r>
-        <w:t xml:space="preserve"> </w:t>
-      </w:r>
-      <w:proofErr w:type="spellStart"/>
+        <w:t xml:space="preserve">Thay đổi trong </w:t>
+      </w:r>
       <w:r>
         <w:rPr>
           <w:rStyle w:val="Strong"/>
         </w:rPr>
-        <w:t>chỉ</w:t>
-      </w:r>
-      <w:proofErr w:type="spellEnd"/>
+        <w:t>chỉ mục</w:t>
+      </w:r>
+      <w:r>
+        <w:t xml:space="preserve"> và </w:t>
+      </w:r>
       <w:r>
         <w:rPr>
           <w:rStyle w:val="Strong"/>
         </w:rPr>
-        <w:t xml:space="preserve"> </w:t>
-      </w:r>
-      <w:proofErr w:type="spellStart"/>
-      <w:r>
-        <w:rPr>
-          <w:rStyle w:val="Strong"/>
-        </w:rPr>
-        <w:t>mục</w:t>
-      </w:r>
-      <w:proofErr w:type="spellEnd"/>
-      <w:r>
-        <w:t xml:space="preserve"> </w:t>
-      </w:r>
-      <w:proofErr w:type="spellStart"/>
-      <w:r>
-        <w:t>và</w:t>
-      </w:r>
-      <w:proofErr w:type="spellEnd"/>
-      <w:r>
-        <w:t xml:space="preserve"> </w:t>
-      </w:r>
-      <w:proofErr w:type="spellStart"/>
-      <w:r>
-        <w:rPr>
-          <w:rStyle w:val="Strong"/>
-        </w:rPr>
-        <w:t>thư</w:t>
-      </w:r>
-      <w:proofErr w:type="spellEnd"/>
-      <w:r>
-        <w:rPr>
-          <w:rStyle w:val="Strong"/>
-        </w:rPr>
-        <w:t xml:space="preserve"> </w:t>
-      </w:r>
-      <w:proofErr w:type="spellStart"/>
-      <w:r>
-        <w:rPr>
-          <w:rStyle w:val="Strong"/>
-        </w:rPr>
-        <w:t>mục</w:t>
-      </w:r>
-      <w:proofErr w:type="spellEnd"/>
-      <w:r>
-        <w:rPr>
-          <w:rStyle w:val="Strong"/>
-        </w:rPr>
-        <w:t xml:space="preserve"> </w:t>
-      </w:r>
-      <w:proofErr w:type="spellStart"/>
-      <w:r>
-        <w:rPr>
-          <w:rStyle w:val="Strong"/>
-        </w:rPr>
-        <w:t>làm</w:t>
-      </w:r>
-      <w:proofErr w:type="spellEnd"/>
-      <w:r>
-        <w:rPr>
-          <w:rStyle w:val="Strong"/>
-        </w:rPr>
-        <w:t xml:space="preserve"> </w:t>
-      </w:r>
-      <w:proofErr w:type="spellStart"/>
-      <w:r>
-        <w:rPr>
-          <w:rStyle w:val="Strong"/>
-        </w:rPr>
-        <w:t>việc</w:t>
-      </w:r>
-      <w:proofErr w:type="spellEnd"/>
-      <w:r>
-        <w:t xml:space="preserve"> </w:t>
-      </w:r>
-      <w:proofErr w:type="spellStart"/>
-      <w:r>
-        <w:t>sẽ</w:t>
-      </w:r>
-      <w:proofErr w:type="spellEnd"/>
-      <w:r>
-        <w:t xml:space="preserve"> </w:t>
-      </w:r>
-      <w:proofErr w:type="spellStart"/>
-      <w:r>
-        <w:t>được</w:t>
-      </w:r>
-      <w:proofErr w:type="spellEnd"/>
-      <w:r>
-        <w:t xml:space="preserve"> </w:t>
-      </w:r>
-      <w:proofErr w:type="spellStart"/>
-      <w:r>
-        <w:t>lưu</w:t>
-      </w:r>
-      <w:proofErr w:type="spellEnd"/>
-      <w:r>
-        <w:t xml:space="preserve"> </w:t>
-      </w:r>
-      <w:proofErr w:type="spellStart"/>
-      <w:r>
-        <w:t>vào</w:t>
-      </w:r>
-      <w:proofErr w:type="spellEnd"/>
-      <w:r>
-        <w:t xml:space="preserve"> stash.</w:t>
+        <w:t>thư mục làm việc</w:t>
+      </w:r>
+      <w:r>
+        <w:t xml:space="preserve"> sẽ được lưu vào stash.</w:t>
       </w:r>
     </w:p>
     <w:p>
@@ -438,8 +139,76 @@
           <w:sz w:val="24"/>
           <w:szCs w:val="24"/>
         </w:rPr>
-        <w:t>1.</w:t>
-      </w:r>
+        <w:t>1.git stash list</w:t>
+      </w:r>
+      <w:r>
+        <w:rPr>
+          <w:b/>
+          <w:bCs/>
+        </w:rPr>
+        <w:t>:</w:t>
+      </w:r>
+    </w:p>
+    <w:p>
+      <w:pPr>
+        <w:pStyle w:val="NormalWeb"/>
+      </w:pPr>
+      <w:r>
+        <w:t xml:space="preserve">Liệt kê tất cả các stash hiện có. Mỗi stash sẽ có một tên như </w:t>
+      </w:r>
+      <w:r>
+        <w:rPr>
+          <w:rStyle w:val="HTMLCode"/>
+          <w:rFonts w:ascii="Times New Roman" w:hAnsi="Times New Roman" w:cs="Times New Roman"/>
+          <w:sz w:val="24"/>
+          <w:szCs w:val="24"/>
+        </w:rPr>
+        <w:t>stash</w:t>
+      </w:r>
+      <w:proofErr w:type="gramStart"/>
+      <w:r>
+        <w:rPr>
+          <w:rStyle w:val="HTMLCode"/>
+          <w:rFonts w:ascii="Times New Roman" w:hAnsi="Times New Roman" w:cs="Times New Roman"/>
+          <w:sz w:val="24"/>
+          <w:szCs w:val="24"/>
+        </w:rPr>
+        <w:t>@{</w:t>
+      </w:r>
+      <w:proofErr w:type="gramEnd"/>
+      <w:r>
+        <w:rPr>
+          <w:rStyle w:val="HTMLCode"/>
+          <w:rFonts w:ascii="Times New Roman" w:hAnsi="Times New Roman" w:cs="Times New Roman"/>
+          <w:sz w:val="24"/>
+          <w:szCs w:val="24"/>
+        </w:rPr>
+        <w:t>0}</w:t>
+      </w:r>
+      <w:r>
+        <w:t xml:space="preserve">, </w:t>
+      </w:r>
+      <w:r>
+        <w:rPr>
+          <w:rStyle w:val="HTMLCode"/>
+          <w:rFonts w:ascii="Times New Roman" w:hAnsi="Times New Roman" w:cs="Times New Roman"/>
+          <w:sz w:val="24"/>
+          <w:szCs w:val="24"/>
+        </w:rPr>
+        <w:t>stash@{1}</w:t>
+      </w:r>
+      <w:r>
+        <w:t>, v.v.</w:t>
+      </w:r>
+    </w:p>
+    <w:p>
+      <w:pPr>
+        <w:pStyle w:val="NormalWeb"/>
+        <w:rPr>
+          <w:b/>
+          <w:bCs/>
+        </w:rPr>
+      </w:pPr>
       <w:r>
         <w:rPr>
           <w:rStyle w:val="HTMLCode"/>
@@ -449,7 +218,7 @@
           <w:sz w:val="24"/>
           <w:szCs w:val="24"/>
         </w:rPr>
-        <w:t>git stash list</w:t>
+        <w:t>2.git stash show</w:t>
       </w:r>
       <w:r>
         <w:rPr>
@@ -463,109 +232,8 @@
       <w:pPr>
         <w:pStyle w:val="NormalWeb"/>
       </w:pPr>
-      <w:proofErr w:type="spellStart"/>
-      <w:r>
-        <w:t>Liệt</w:t>
-      </w:r>
-      <w:proofErr w:type="spellEnd"/>
-      <w:r>
-        <w:t xml:space="preserve"> </w:t>
-      </w:r>
-      <w:proofErr w:type="spellStart"/>
-      <w:r>
-        <w:t>kê</w:t>
-      </w:r>
-      <w:proofErr w:type="spellEnd"/>
-      <w:r>
-        <w:t xml:space="preserve"> </w:t>
-      </w:r>
-      <w:proofErr w:type="spellStart"/>
-      <w:r>
-        <w:t>tất</w:t>
-      </w:r>
-      <w:proofErr w:type="spellEnd"/>
-      <w:r>
-        <w:t xml:space="preserve"> </w:t>
-      </w:r>
-      <w:proofErr w:type="spellStart"/>
-      <w:r>
-        <w:t>cả</w:t>
-      </w:r>
-      <w:proofErr w:type="spellEnd"/>
-      <w:r>
-        <w:t xml:space="preserve"> </w:t>
-      </w:r>
-      <w:proofErr w:type="spellStart"/>
-      <w:r>
-        <w:t>các</w:t>
-      </w:r>
-      <w:proofErr w:type="spellEnd"/>
-      <w:r>
-        <w:t xml:space="preserve"> stash </w:t>
-      </w:r>
-      <w:proofErr w:type="spellStart"/>
-      <w:r>
-        <w:t>hiện</w:t>
-      </w:r>
-      <w:proofErr w:type="spellEnd"/>
-      <w:r>
-        <w:t xml:space="preserve"> </w:t>
-      </w:r>
-      <w:proofErr w:type="spellStart"/>
-      <w:r>
-        <w:t>có</w:t>
-      </w:r>
-      <w:proofErr w:type="spellEnd"/>
-      <w:r>
-        <w:t xml:space="preserve">. </w:t>
-      </w:r>
-      <w:proofErr w:type="spellStart"/>
-      <w:r>
-        <w:t>Mỗi</w:t>
-      </w:r>
-      <w:proofErr w:type="spellEnd"/>
-      <w:r>
-        <w:t xml:space="preserve"> stash </w:t>
-      </w:r>
-      <w:proofErr w:type="spellStart"/>
-      <w:r>
-        <w:t>sẽ</w:t>
-      </w:r>
-      <w:proofErr w:type="spellEnd"/>
-      <w:r>
-        <w:t xml:space="preserve"> </w:t>
-      </w:r>
-      <w:proofErr w:type="spellStart"/>
-      <w:r>
-        <w:t>có</w:t>
-      </w:r>
-      <w:proofErr w:type="spellEnd"/>
-      <w:r>
-        <w:t xml:space="preserve"> </w:t>
-      </w:r>
-      <w:proofErr w:type="spellStart"/>
-      <w:r>
-        <w:t>một</w:t>
-      </w:r>
-      <w:proofErr w:type="spellEnd"/>
-      <w:r>
-        <w:t xml:space="preserve"> </w:t>
-      </w:r>
-      <w:proofErr w:type="spellStart"/>
-      <w:r>
-        <w:t>tên</w:t>
-      </w:r>
-      <w:proofErr w:type="spellEnd"/>
-      <w:r>
-        <w:t xml:space="preserve"> </w:t>
-      </w:r>
-      <w:proofErr w:type="spellStart"/>
-      <w:r>
-        <w:t>như</w:t>
-      </w:r>
-      <w:proofErr w:type="spellEnd"/>
-      <w:r>
-        <w:t xml:space="preserve"> </w:t>
+      <w:r>
+        <w:t xml:space="preserve">Hiển thị nội dung của stash gần nhất (mặc định là </w:t>
       </w:r>
       <w:r>
         <w:rPr>
@@ -597,7 +265,7 @@
         <w:t>0}</w:t>
       </w:r>
       <w:r>
-        <w:t xml:space="preserve">, </w:t>
+        <w:t xml:space="preserve">). Nếu bạn muốn xem chi tiết hơn, có thể dùng thêm tham số </w:t>
       </w:r>
       <w:r>
         <w:rPr>
@@ -606,10 +274,10 @@
           <w:sz w:val="24"/>
           <w:szCs w:val="24"/>
         </w:rPr>
-        <w:t>stash@{1}</w:t>
-      </w:r>
-      <w:r>
-        <w:t>, v.v.</w:t>
+        <w:t>-p</w:t>
+      </w:r>
+      <w:r>
+        <w:t xml:space="preserve"> (patch).</w:t>
       </w:r>
     </w:p>
     <w:p>
@@ -629,8 +297,64 @@
           <w:sz w:val="24"/>
           <w:szCs w:val="24"/>
         </w:rPr>
-        <w:t>2.</w:t>
-      </w:r>
+        <w:t>3.git stash apply &lt;stash&gt;</w:t>
+      </w:r>
+      <w:r>
+        <w:rPr>
+          <w:b/>
+          <w:bCs/>
+        </w:rPr>
+        <w:t>:</w:t>
+      </w:r>
+    </w:p>
+    <w:p>
+      <w:pPr>
+        <w:pStyle w:val="NormalWeb"/>
+      </w:pPr>
+      <w:r>
+        <w:t xml:space="preserve">Áp dụng các thay đổi từ một stash vào thư mục làm việc hiện tại. Nếu bạn không chỉ định stash, mặc định nó sẽ áp dụng </w:t>
+      </w:r>
+      <w:r>
+        <w:rPr>
+          <w:rStyle w:val="HTMLCode"/>
+          <w:rFonts w:ascii="Times New Roman" w:hAnsi="Times New Roman" w:cs="Times New Roman"/>
+          <w:sz w:val="24"/>
+          <w:szCs w:val="24"/>
+        </w:rPr>
+        <w:t>stash</w:t>
+      </w:r>
+      <w:proofErr w:type="gramStart"/>
+      <w:r>
+        <w:rPr>
+          <w:rStyle w:val="HTMLCode"/>
+          <w:rFonts w:ascii="Times New Roman" w:hAnsi="Times New Roman" w:cs="Times New Roman"/>
+          <w:sz w:val="24"/>
+          <w:szCs w:val="24"/>
+        </w:rPr>
+        <w:t>@{</w:t>
+      </w:r>
+      <w:proofErr w:type="gramEnd"/>
+      <w:r>
+        <w:rPr>
+          <w:rStyle w:val="HTMLCode"/>
+          <w:rFonts w:ascii="Times New Roman" w:hAnsi="Times New Roman" w:cs="Times New Roman"/>
+          <w:sz w:val="24"/>
+          <w:szCs w:val="24"/>
+        </w:rPr>
+        <w:t>0}</w:t>
+      </w:r>
+      <w:r>
+        <w:t xml:space="preserve"> (stash gần nhất).</w:t>
+      </w:r>
+    </w:p>
+    <w:p>
+      <w:pPr>
+        <w:pStyle w:val="NormalWeb"/>
+        <w:rPr>
+          <w:b/>
+          <w:bCs/>
+        </w:rPr>
+      </w:pPr>
       <w:r>
         <w:rPr>
           <w:rStyle w:val="HTMLCode"/>
@@ -640,7 +364,7 @@
           <w:sz w:val="24"/>
           <w:szCs w:val="24"/>
         </w:rPr>
-        <w:t>git stash show</w:t>
+        <w:t>4.git stash pop</w:t>
       </w:r>
       <w:r>
         <w:rPr>
@@ -655,71 +379,7 @@
         <w:pStyle w:val="NormalWeb"/>
       </w:pPr>
       <w:r>
-        <w:t xml:space="preserve">Hiển </w:t>
-      </w:r>
-      <w:proofErr w:type="spellStart"/>
-      <w:r>
-        <w:t>thị</w:t>
-      </w:r>
-      <w:proofErr w:type="spellEnd"/>
-      <w:r>
-        <w:t xml:space="preserve"> </w:t>
-      </w:r>
-      <w:proofErr w:type="spellStart"/>
-      <w:r>
-        <w:t>nội</w:t>
-      </w:r>
-      <w:proofErr w:type="spellEnd"/>
-      <w:r>
-        <w:t xml:space="preserve"> dung </w:t>
-      </w:r>
-      <w:proofErr w:type="spellStart"/>
-      <w:r>
-        <w:t>của</w:t>
-      </w:r>
-      <w:proofErr w:type="spellEnd"/>
-      <w:r>
-        <w:t xml:space="preserve"> stash </w:t>
-      </w:r>
-      <w:proofErr w:type="spellStart"/>
-      <w:r>
-        <w:t>gần</w:t>
-      </w:r>
-      <w:proofErr w:type="spellEnd"/>
-      <w:r>
-        <w:t xml:space="preserve"> </w:t>
-      </w:r>
-      <w:proofErr w:type="spellStart"/>
-      <w:r>
-        <w:t>nhất</w:t>
-      </w:r>
-      <w:proofErr w:type="spellEnd"/>
-      <w:r>
-        <w:t xml:space="preserve"> (</w:t>
-      </w:r>
-      <w:proofErr w:type="spellStart"/>
-      <w:r>
-        <w:t>mặc</w:t>
-      </w:r>
-      <w:proofErr w:type="spellEnd"/>
-      <w:r>
-        <w:t xml:space="preserve"> </w:t>
-      </w:r>
-      <w:proofErr w:type="spellStart"/>
-      <w:r>
-        <w:t>định</w:t>
-      </w:r>
-      <w:proofErr w:type="spellEnd"/>
-      <w:r>
-        <w:t xml:space="preserve"> </w:t>
-      </w:r>
-      <w:proofErr w:type="spellStart"/>
-      <w:r>
-        <w:t>là</w:t>
-      </w:r>
-      <w:proofErr w:type="spellEnd"/>
-      <w:r>
-        <w:t xml:space="preserve"> </w:t>
+        <w:t xml:space="preserve">Tương tự như </w:t>
       </w:r>
       <w:r>
         <w:rPr>
@@ -728,138 +388,28 @@
           <w:sz w:val="24"/>
           <w:szCs w:val="24"/>
         </w:rPr>
-        <w:t>stash</w:t>
-      </w:r>
-      <w:proofErr w:type="gramStart"/>
-      <w:r>
-        <w:rPr>
-          <w:rStyle w:val="HTMLCode"/>
-          <w:rFonts w:ascii="Times New Roman" w:hAnsi="Times New Roman" w:cs="Times New Roman"/>
-          <w:sz w:val="24"/>
-          <w:szCs w:val="24"/>
-        </w:rPr>
-        <w:t>@{</w:t>
-      </w:r>
-      <w:proofErr w:type="gramEnd"/>
-      <w:r>
-        <w:rPr>
-          <w:rStyle w:val="HTMLCode"/>
-          <w:rFonts w:ascii="Times New Roman" w:hAnsi="Times New Roman" w:cs="Times New Roman"/>
-          <w:sz w:val="24"/>
-          <w:szCs w:val="24"/>
-        </w:rPr>
-        <w:t>0}</w:t>
-      </w:r>
-      <w:r>
-        <w:t xml:space="preserve">). </w:t>
-      </w:r>
-      <w:proofErr w:type="spellStart"/>
-      <w:r>
-        <w:t>Nếu</w:t>
-      </w:r>
-      <w:proofErr w:type="spellEnd"/>
-      <w:r>
-        <w:t xml:space="preserve"> </w:t>
-      </w:r>
-      <w:proofErr w:type="spellStart"/>
-      <w:r>
-        <w:t>bạn</w:t>
-      </w:r>
-      <w:proofErr w:type="spellEnd"/>
-      <w:r>
-        <w:t xml:space="preserve"> </w:t>
-      </w:r>
-      <w:proofErr w:type="spellStart"/>
-      <w:r>
-        <w:t>muốn</w:t>
-      </w:r>
-      <w:proofErr w:type="spellEnd"/>
-      <w:r>
-        <w:t xml:space="preserve"> </w:t>
-      </w:r>
-      <w:proofErr w:type="spellStart"/>
-      <w:r>
-        <w:t>xem</w:t>
-      </w:r>
-      <w:proofErr w:type="spellEnd"/>
-      <w:r>
-        <w:t xml:space="preserve"> chi </w:t>
-      </w:r>
-      <w:proofErr w:type="spellStart"/>
-      <w:r>
-        <w:t>tiết</w:t>
-      </w:r>
-      <w:proofErr w:type="spellEnd"/>
-      <w:r>
-        <w:t xml:space="preserve"> </w:t>
-      </w:r>
-      <w:proofErr w:type="spellStart"/>
-      <w:r>
-        <w:t>hơn</w:t>
-      </w:r>
-      <w:proofErr w:type="spellEnd"/>
-      <w:r>
-        <w:t xml:space="preserve">, </w:t>
-      </w:r>
-      <w:proofErr w:type="spellStart"/>
-      <w:r>
-        <w:t>có</w:t>
-      </w:r>
-      <w:proofErr w:type="spellEnd"/>
-      <w:r>
-        <w:t xml:space="preserve"> </w:t>
-      </w:r>
-      <w:proofErr w:type="spellStart"/>
-      <w:r>
-        <w:t>thể</w:t>
-      </w:r>
-      <w:proofErr w:type="spellEnd"/>
-      <w:r>
-        <w:t xml:space="preserve"> </w:t>
-      </w:r>
-      <w:proofErr w:type="spellStart"/>
-      <w:r>
-        <w:t>dùng</w:t>
-      </w:r>
-      <w:proofErr w:type="spellEnd"/>
-      <w:r>
-        <w:t xml:space="preserve"> </w:t>
-      </w:r>
-      <w:proofErr w:type="spellStart"/>
-      <w:r>
-        <w:t>thêm</w:t>
-      </w:r>
-      <w:proofErr w:type="spellEnd"/>
-      <w:r>
-        <w:t xml:space="preserve"> </w:t>
-      </w:r>
-      <w:proofErr w:type="spellStart"/>
-      <w:r>
-        <w:t>tham</w:t>
-      </w:r>
-      <w:proofErr w:type="spellEnd"/>
-      <w:r>
-        <w:t xml:space="preserve"> </w:t>
-      </w:r>
-      <w:proofErr w:type="spellStart"/>
-      <w:r>
-        <w:t>số</w:t>
-      </w:r>
-      <w:proofErr w:type="spellEnd"/>
-      <w:r>
-        <w:t xml:space="preserve"> </w:t>
-      </w:r>
-      <w:r>
-        <w:rPr>
-          <w:rStyle w:val="HTMLCode"/>
-          <w:rFonts w:ascii="Times New Roman" w:hAnsi="Times New Roman" w:cs="Times New Roman"/>
-          <w:sz w:val="24"/>
-          <w:szCs w:val="24"/>
-        </w:rPr>
-        <w:t>-p</w:t>
-      </w:r>
-      <w:r>
-        <w:t xml:space="preserve"> (patch).</w:t>
+        <w:t>git stash apply</w:t>
+      </w:r>
+      <w:r>
+        <w:t xml:space="preserve">, nhưng lệnh này sẽ </w:t>
+      </w:r>
+      <w:r>
+        <w:rPr>
+          <w:rStyle w:val="Strong"/>
+        </w:rPr>
+        <w:t>áp dụng</w:t>
+      </w:r>
+      <w:r>
+        <w:t xml:space="preserve"> thay đổi từ stash và </w:t>
+      </w:r>
+      <w:r>
+        <w:rPr>
+          <w:rStyle w:val="Strong"/>
+        </w:rPr>
+        <w:t>xóa stash</w:t>
+      </w:r>
+      <w:r>
+        <w:t xml:space="preserve"> đó khỏi danh sách stash.</w:t>
       </w:r>
     </w:p>
     <w:p>
@@ -879,8 +429,32 @@
           <w:sz w:val="24"/>
           <w:szCs w:val="24"/>
         </w:rPr>
-        <w:t>3.</w:t>
-      </w:r>
+        <w:t>5.git stash drop &lt;stash&gt;</w:t>
+      </w:r>
+      <w:r>
+        <w:rPr>
+          <w:b/>
+          <w:bCs/>
+        </w:rPr>
+        <w:t>:</w:t>
+      </w:r>
+    </w:p>
+    <w:p>
+      <w:pPr>
+        <w:pStyle w:val="NormalWeb"/>
+      </w:pPr>
+      <w:r>
+        <w:t>Xóa một stash cụ thể khỏi danh sách stash mà không áp dụng nó.</w:t>
+      </w:r>
+    </w:p>
+    <w:p>
+      <w:pPr>
+        <w:pStyle w:val="NormalWeb"/>
+        <w:rPr>
+          <w:b/>
+          <w:bCs/>
+        </w:rPr>
+      </w:pPr>
       <w:r>
         <w:rPr>
           <w:rStyle w:val="HTMLCode"/>
@@ -890,7 +464,7 @@
           <w:sz w:val="24"/>
           <w:szCs w:val="24"/>
         </w:rPr>
-        <w:t>git stash apply &lt;stash&gt;</w:t>
+        <w:t>6.git stash clear</w:t>
       </w:r>
       <w:r>
         <w:rPr>
@@ -904,794 +478,71 @@
       <w:pPr>
         <w:pStyle w:val="NormalWeb"/>
       </w:pPr>
-      <w:proofErr w:type="spellStart"/>
-      <w:r>
-        <w:t>Áp</w:t>
-      </w:r>
-      <w:proofErr w:type="spellEnd"/>
-      <w:r>
-        <w:t xml:space="preserve"> </w:t>
-      </w:r>
-      <w:proofErr w:type="spellStart"/>
-      <w:r>
-        <w:t>dụng</w:t>
-      </w:r>
-      <w:proofErr w:type="spellEnd"/>
-      <w:r>
-        <w:t xml:space="preserve"> </w:t>
-      </w:r>
-      <w:proofErr w:type="spellStart"/>
-      <w:r>
-        <w:t>các</w:t>
-      </w:r>
-      <w:proofErr w:type="spellEnd"/>
-      <w:r>
-        <w:t xml:space="preserve"> </w:t>
-      </w:r>
-      <w:proofErr w:type="spellStart"/>
-      <w:r>
-        <w:t>thay</w:t>
-      </w:r>
-      <w:proofErr w:type="spellEnd"/>
-      <w:r>
-        <w:t xml:space="preserve"> </w:t>
-      </w:r>
-      <w:proofErr w:type="spellStart"/>
-      <w:r>
-        <w:t>đổi</w:t>
-      </w:r>
-      <w:proofErr w:type="spellEnd"/>
-      <w:r>
-        <w:t xml:space="preserve"> </w:t>
-      </w:r>
-      <w:proofErr w:type="spellStart"/>
-      <w:r>
-        <w:t>từ</w:t>
-      </w:r>
-      <w:proofErr w:type="spellEnd"/>
-      <w:r>
-        <w:t xml:space="preserve"> </w:t>
-      </w:r>
-      <w:proofErr w:type="spellStart"/>
-      <w:r>
-        <w:t>một</w:t>
-      </w:r>
-      <w:proofErr w:type="spellEnd"/>
-      <w:r>
-        <w:t xml:space="preserve"> stash </w:t>
-      </w:r>
-      <w:proofErr w:type="spellStart"/>
-      <w:r>
-        <w:t>vào</w:t>
-      </w:r>
-      <w:proofErr w:type="spellEnd"/>
-      <w:r>
-        <w:t xml:space="preserve"> </w:t>
-      </w:r>
-      <w:proofErr w:type="spellStart"/>
-      <w:r>
-        <w:t>thư</w:t>
-      </w:r>
-      <w:proofErr w:type="spellEnd"/>
-      <w:r>
-        <w:t xml:space="preserve"> </w:t>
-      </w:r>
-      <w:proofErr w:type="spellStart"/>
-      <w:r>
-        <w:t>mục</w:t>
-      </w:r>
-      <w:proofErr w:type="spellEnd"/>
-      <w:r>
-        <w:t xml:space="preserve"> </w:t>
-      </w:r>
-      <w:proofErr w:type="spellStart"/>
-      <w:r>
-        <w:t>làm</w:t>
-      </w:r>
-      <w:proofErr w:type="spellEnd"/>
-      <w:r>
-        <w:t xml:space="preserve"> </w:t>
-      </w:r>
-      <w:proofErr w:type="spellStart"/>
-      <w:r>
-        <w:t>việc</w:t>
-      </w:r>
-      <w:proofErr w:type="spellEnd"/>
-      <w:r>
-        <w:t xml:space="preserve"> </w:t>
-      </w:r>
-      <w:proofErr w:type="spellStart"/>
-      <w:r>
-        <w:t>hiện</w:t>
-      </w:r>
-      <w:proofErr w:type="spellEnd"/>
-      <w:r>
-        <w:t xml:space="preserve"> </w:t>
-      </w:r>
-      <w:proofErr w:type="spellStart"/>
-      <w:r>
-        <w:t>tại</w:t>
-      </w:r>
-      <w:proofErr w:type="spellEnd"/>
-      <w:r>
-        <w:t xml:space="preserve">. </w:t>
-      </w:r>
-      <w:proofErr w:type="spellStart"/>
-      <w:r>
-        <w:t>Nếu</w:t>
-      </w:r>
-      <w:proofErr w:type="spellEnd"/>
-      <w:r>
-        <w:t xml:space="preserve"> </w:t>
-      </w:r>
-      <w:proofErr w:type="spellStart"/>
-      <w:r>
-        <w:t>bạn</w:t>
-      </w:r>
-      <w:proofErr w:type="spellEnd"/>
-      <w:r>
-        <w:t xml:space="preserve"> </w:t>
-      </w:r>
-      <w:proofErr w:type="spellStart"/>
-      <w:r>
-        <w:t>không</w:t>
-      </w:r>
-      <w:proofErr w:type="spellEnd"/>
-      <w:r>
-        <w:t xml:space="preserve"> </w:t>
-      </w:r>
-      <w:proofErr w:type="spellStart"/>
-      <w:r>
-        <w:t>chỉ</w:t>
-      </w:r>
-      <w:proofErr w:type="spellEnd"/>
-      <w:r>
-        <w:t xml:space="preserve"> </w:t>
-      </w:r>
-      <w:proofErr w:type="spellStart"/>
-      <w:r>
-        <w:t>định</w:t>
-      </w:r>
-      <w:proofErr w:type="spellEnd"/>
-      <w:r>
-        <w:t xml:space="preserve"> stash, </w:t>
-      </w:r>
-      <w:proofErr w:type="spellStart"/>
-      <w:r>
-        <w:t>mặc</w:t>
-      </w:r>
-      <w:proofErr w:type="spellEnd"/>
-      <w:r>
-        <w:t xml:space="preserve"> </w:t>
-      </w:r>
-      <w:proofErr w:type="spellStart"/>
-      <w:r>
-        <w:t>định</w:t>
-      </w:r>
-      <w:proofErr w:type="spellEnd"/>
-      <w:r>
-        <w:t xml:space="preserve"> </w:t>
-      </w:r>
-      <w:proofErr w:type="spellStart"/>
-      <w:r>
-        <w:t>nó</w:t>
-      </w:r>
-      <w:proofErr w:type="spellEnd"/>
-      <w:r>
-        <w:t xml:space="preserve"> </w:t>
-      </w:r>
-      <w:proofErr w:type="spellStart"/>
-      <w:r>
-        <w:t>sẽ</w:t>
-      </w:r>
-      <w:proofErr w:type="spellEnd"/>
-      <w:r>
-        <w:t xml:space="preserve"> </w:t>
-      </w:r>
-      <w:proofErr w:type="spellStart"/>
-      <w:r>
-        <w:t>áp</w:t>
-      </w:r>
-      <w:proofErr w:type="spellEnd"/>
-      <w:r>
-        <w:t xml:space="preserve"> </w:t>
-      </w:r>
-      <w:proofErr w:type="spellStart"/>
-      <w:r>
-        <w:t>dụng</w:t>
-      </w:r>
-      <w:proofErr w:type="spellEnd"/>
-      <w:r>
-        <w:t xml:space="preserve"> </w:t>
-      </w:r>
-      <w:r>
-        <w:rPr>
-          <w:rStyle w:val="HTMLCode"/>
-          <w:rFonts w:ascii="Times New Roman" w:hAnsi="Times New Roman" w:cs="Times New Roman"/>
-          <w:sz w:val="24"/>
-          <w:szCs w:val="24"/>
-        </w:rPr>
-        <w:t>stash</w:t>
-      </w:r>
-      <w:proofErr w:type="gramStart"/>
-      <w:r>
-        <w:rPr>
-          <w:rStyle w:val="HTMLCode"/>
-          <w:rFonts w:ascii="Times New Roman" w:hAnsi="Times New Roman" w:cs="Times New Roman"/>
-          <w:sz w:val="24"/>
-          <w:szCs w:val="24"/>
-        </w:rPr>
-        <w:t>@{</w:t>
-      </w:r>
-      <w:proofErr w:type="gramEnd"/>
-      <w:r>
-        <w:rPr>
-          <w:rStyle w:val="HTMLCode"/>
-          <w:rFonts w:ascii="Times New Roman" w:hAnsi="Times New Roman" w:cs="Times New Roman"/>
-          <w:sz w:val="24"/>
-          <w:szCs w:val="24"/>
-        </w:rPr>
-        <w:t>0}</w:t>
-      </w:r>
-      <w:r>
-        <w:t xml:space="preserve"> (stash </w:t>
-      </w:r>
-      <w:proofErr w:type="spellStart"/>
-      <w:r>
-        <w:t>gần</w:t>
-      </w:r>
-      <w:proofErr w:type="spellEnd"/>
-      <w:r>
-        <w:t xml:space="preserve"> </w:t>
-      </w:r>
-      <w:proofErr w:type="spellStart"/>
-      <w:r>
-        <w:t>nhất</w:t>
-      </w:r>
-      <w:proofErr w:type="spellEnd"/>
-      <w:r>
-        <w:t>).</w:t>
+      <w:r>
+        <w:t>Xóa tất cả các stash trong danh sách, giữ repository của bạn sạch sẽ và không có bất kỳ stash nào</w:t>
       </w:r>
     </w:p>
     <w:p>
       <w:pPr>
         <w:pStyle w:val="NormalWeb"/>
-        <w:rPr>
-          <w:b/>
-          <w:bCs/>
-        </w:rPr>
-      </w:pPr>
-      <w:r>
-        <w:rPr>
-          <w:rStyle w:val="HTMLCode"/>
-          <w:rFonts w:ascii="Times New Roman" w:hAnsi="Times New Roman" w:cs="Times New Roman"/>
-          <w:b/>
-          <w:bCs/>
-          <w:sz w:val="24"/>
-          <w:szCs w:val="24"/>
-        </w:rPr>
-        <w:t>4.</w:t>
-      </w:r>
-      <w:r>
-        <w:rPr>
-          <w:rStyle w:val="HTMLCode"/>
-          <w:rFonts w:ascii="Times New Roman" w:hAnsi="Times New Roman" w:cs="Times New Roman"/>
-          <w:b/>
-          <w:bCs/>
-          <w:sz w:val="24"/>
-          <w:szCs w:val="24"/>
-        </w:rPr>
-        <w:t>git stash pop</w:t>
-      </w:r>
-      <w:r>
-        <w:rPr>
-          <w:b/>
-          <w:bCs/>
-        </w:rPr>
-        <w:t>:</w:t>
-      </w:r>
+      </w:pPr>
     </w:p>
     <w:p>
       <w:pPr>
         <w:pStyle w:val="NormalWeb"/>
       </w:pPr>
-      <w:proofErr w:type="spellStart"/>
-      <w:r>
-        <w:t>Tương</w:t>
-      </w:r>
-      <w:proofErr w:type="spellEnd"/>
-      <w:r>
-        <w:t xml:space="preserve"> </w:t>
-      </w:r>
-      <w:proofErr w:type="spellStart"/>
-      <w:r>
-        <w:t>tự</w:t>
-      </w:r>
-      <w:proofErr w:type="spellEnd"/>
-      <w:r>
-        <w:t xml:space="preserve"> </w:t>
-      </w:r>
-      <w:proofErr w:type="spellStart"/>
-      <w:r>
-        <w:t>như</w:t>
-      </w:r>
-      <w:proofErr w:type="spellEnd"/>
-      <w:r>
-        <w:t xml:space="preserve"> </w:t>
-      </w:r>
-      <w:r>
-        <w:rPr>
-          <w:rStyle w:val="HTMLCode"/>
-          <w:rFonts w:ascii="Times New Roman" w:hAnsi="Times New Roman" w:cs="Times New Roman"/>
-          <w:sz w:val="24"/>
-          <w:szCs w:val="24"/>
-        </w:rPr>
-        <w:t>git stash apply</w:t>
-      </w:r>
-      <w:r>
-        <w:t xml:space="preserve">, </w:t>
-      </w:r>
-      <w:proofErr w:type="spellStart"/>
-      <w:r>
-        <w:t>nhưng</w:t>
-      </w:r>
-      <w:proofErr w:type="spellEnd"/>
-      <w:r>
-        <w:t xml:space="preserve"> </w:t>
-      </w:r>
-      <w:proofErr w:type="spellStart"/>
-      <w:r>
-        <w:t>lệnh</w:t>
-      </w:r>
-      <w:proofErr w:type="spellEnd"/>
-      <w:r>
-        <w:t xml:space="preserve"> </w:t>
-      </w:r>
-      <w:proofErr w:type="spellStart"/>
-      <w:r>
-        <w:t>này</w:t>
-      </w:r>
-      <w:proofErr w:type="spellEnd"/>
-      <w:r>
-        <w:t xml:space="preserve"> </w:t>
-      </w:r>
-      <w:proofErr w:type="spellStart"/>
-      <w:r>
-        <w:t>sẽ</w:t>
-      </w:r>
-      <w:proofErr w:type="spellEnd"/>
-      <w:r>
-        <w:t xml:space="preserve"> </w:t>
-      </w:r>
-      <w:proofErr w:type="spellStart"/>
-      <w:r>
-        <w:rPr>
-          <w:rStyle w:val="Strong"/>
-        </w:rPr>
-        <w:t>áp</w:t>
-      </w:r>
-      <w:proofErr w:type="spellEnd"/>
-      <w:r>
-        <w:rPr>
-          <w:rStyle w:val="Strong"/>
-        </w:rPr>
-        <w:t xml:space="preserve"> </w:t>
-      </w:r>
-      <w:proofErr w:type="spellStart"/>
-      <w:r>
-        <w:rPr>
-          <w:rStyle w:val="Strong"/>
-        </w:rPr>
-        <w:t>dụng</w:t>
-      </w:r>
-      <w:proofErr w:type="spellEnd"/>
-      <w:r>
-        <w:t xml:space="preserve"> </w:t>
-      </w:r>
-      <w:proofErr w:type="spellStart"/>
-      <w:r>
-        <w:t>thay</w:t>
-      </w:r>
-      <w:proofErr w:type="spellEnd"/>
-      <w:r>
-        <w:t xml:space="preserve"> </w:t>
-      </w:r>
-      <w:proofErr w:type="spellStart"/>
-      <w:r>
-        <w:t>đổi</w:t>
-      </w:r>
-      <w:proofErr w:type="spellEnd"/>
-      <w:r>
-        <w:t xml:space="preserve"> </w:t>
-      </w:r>
-      <w:proofErr w:type="spellStart"/>
-      <w:r>
-        <w:t>từ</w:t>
-      </w:r>
-      <w:proofErr w:type="spellEnd"/>
-      <w:r>
-        <w:t xml:space="preserve"> stash </w:t>
-      </w:r>
-      <w:proofErr w:type="spellStart"/>
-      <w:r>
-        <w:t>và</w:t>
-      </w:r>
-      <w:proofErr w:type="spellEnd"/>
-      <w:r>
-        <w:t xml:space="preserve"> </w:t>
-      </w:r>
-      <w:proofErr w:type="spellStart"/>
-      <w:r>
-        <w:rPr>
-          <w:rStyle w:val="Strong"/>
-        </w:rPr>
-        <w:t>xóa</w:t>
-      </w:r>
-      <w:proofErr w:type="spellEnd"/>
-      <w:r>
-        <w:rPr>
-          <w:rStyle w:val="Strong"/>
-        </w:rPr>
-        <w:t xml:space="preserve"> stash</w:t>
-      </w:r>
-      <w:r>
-        <w:t xml:space="preserve"> </w:t>
-      </w:r>
-      <w:proofErr w:type="spellStart"/>
-      <w:r>
-        <w:t>đó</w:t>
-      </w:r>
-      <w:proofErr w:type="spellEnd"/>
-      <w:r>
-        <w:t xml:space="preserve"> </w:t>
-      </w:r>
-      <w:proofErr w:type="spellStart"/>
-      <w:r>
-        <w:t>khỏi</w:t>
-      </w:r>
-      <w:proofErr w:type="spellEnd"/>
-      <w:r>
-        <w:t xml:space="preserve"> </w:t>
-      </w:r>
-      <w:proofErr w:type="spellStart"/>
-      <w:r>
-        <w:t>danh</w:t>
-      </w:r>
-      <w:proofErr w:type="spellEnd"/>
-      <w:r>
-        <w:t xml:space="preserve"> </w:t>
-      </w:r>
-      <w:proofErr w:type="spellStart"/>
-      <w:r>
-        <w:t>sách</w:t>
-      </w:r>
-      <w:proofErr w:type="spellEnd"/>
-      <w:r>
-        <w:t xml:space="preserve"> stash.</w:t>
-      </w:r>
     </w:p>
     <w:p>
       <w:pPr>
         <w:pStyle w:val="NormalWeb"/>
-        <w:rPr>
-          <w:b/>
-          <w:bCs/>
-        </w:rPr>
-      </w:pPr>
-      <w:r>
-        <w:rPr>
-          <w:rStyle w:val="HTMLCode"/>
-          <w:rFonts w:ascii="Times New Roman" w:hAnsi="Times New Roman" w:cs="Times New Roman"/>
-          <w:b/>
-          <w:bCs/>
-          <w:sz w:val="24"/>
-          <w:szCs w:val="24"/>
-        </w:rPr>
-        <w:t>5.</w:t>
-      </w:r>
-      <w:r>
-        <w:rPr>
-          <w:rStyle w:val="HTMLCode"/>
-          <w:rFonts w:ascii="Times New Roman" w:hAnsi="Times New Roman" w:cs="Times New Roman"/>
-          <w:b/>
-          <w:bCs/>
-          <w:sz w:val="24"/>
-          <w:szCs w:val="24"/>
-        </w:rPr>
-        <w:t>git stash drop &lt;stash&gt;</w:t>
-      </w:r>
-      <w:r>
-        <w:rPr>
-          <w:b/>
-          <w:bCs/>
-        </w:rPr>
-        <w:t>:</w:t>
+      </w:pPr>
+      <w:r>
+        <w:t>Cách chạy file</w:t>
       </w:r>
     </w:p>
     <w:p>
       <w:pPr>
         <w:pStyle w:val="NormalWeb"/>
       </w:pPr>
-      <w:proofErr w:type="spellStart"/>
-      <w:r>
-        <w:t>Xóa</w:t>
-      </w:r>
-      <w:proofErr w:type="spellEnd"/>
-      <w:r>
-        <w:t xml:space="preserve"> </w:t>
-      </w:r>
-      <w:proofErr w:type="spellStart"/>
-      <w:r>
-        <w:t>một</w:t>
-      </w:r>
-      <w:proofErr w:type="spellEnd"/>
-      <w:r>
-        <w:t xml:space="preserve"> stash </w:t>
-      </w:r>
-      <w:proofErr w:type="spellStart"/>
-      <w:r>
-        <w:t>cụ</w:t>
-      </w:r>
-      <w:proofErr w:type="spellEnd"/>
-      <w:r>
-        <w:t xml:space="preserve"> </w:t>
-      </w:r>
-      <w:proofErr w:type="spellStart"/>
-      <w:r>
-        <w:t>thể</w:t>
-      </w:r>
-      <w:proofErr w:type="spellEnd"/>
-      <w:r>
-        <w:t xml:space="preserve"> </w:t>
-      </w:r>
-      <w:proofErr w:type="spellStart"/>
-      <w:r>
-        <w:t>khỏi</w:t>
-      </w:r>
-      <w:proofErr w:type="spellEnd"/>
-      <w:r>
-        <w:t xml:space="preserve"> </w:t>
-      </w:r>
-      <w:proofErr w:type="spellStart"/>
-      <w:r>
-        <w:t>danh</w:t>
-      </w:r>
-      <w:proofErr w:type="spellEnd"/>
-      <w:r>
-        <w:t xml:space="preserve"> </w:t>
-      </w:r>
-      <w:proofErr w:type="spellStart"/>
-      <w:r>
-        <w:t>sách</w:t>
-      </w:r>
-      <w:proofErr w:type="spellEnd"/>
-      <w:r>
-        <w:t xml:space="preserve"> stash </w:t>
-      </w:r>
-      <w:proofErr w:type="spellStart"/>
-      <w:r>
-        <w:t>mà</w:t>
-      </w:r>
-      <w:proofErr w:type="spellEnd"/>
-      <w:r>
-        <w:t xml:space="preserve"> </w:t>
-      </w:r>
-      <w:proofErr w:type="spellStart"/>
-      <w:r>
-        <w:t>không</w:t>
-      </w:r>
-      <w:proofErr w:type="spellEnd"/>
-      <w:r>
-        <w:t xml:space="preserve"> </w:t>
-      </w:r>
-      <w:proofErr w:type="spellStart"/>
-      <w:r>
-        <w:t>áp</w:t>
-      </w:r>
-      <w:proofErr w:type="spellEnd"/>
-      <w:r>
-        <w:t xml:space="preserve"> </w:t>
-      </w:r>
-      <w:proofErr w:type="spellStart"/>
-      <w:r>
-        <w:t>dụng</w:t>
-      </w:r>
-      <w:proofErr w:type="spellEnd"/>
-      <w:r>
-        <w:t xml:space="preserve"> </w:t>
-      </w:r>
-      <w:proofErr w:type="spellStart"/>
-      <w:r>
-        <w:t>nó</w:t>
-      </w:r>
-      <w:proofErr w:type="spellEnd"/>
-      <w:r>
-        <w:t>.</w:t>
+      <w:r>
+        <w:t>-</w:t>
+      </w:r>
+      <w:r>
+        <w:t xml:space="preserve"> C++: cần tải chương trình g++</w:t>
       </w:r>
     </w:p>
     <w:p>
       <w:pPr>
         <w:pStyle w:val="NormalWeb"/>
-        <w:rPr>
-          <w:b/>
-          <w:bCs/>
-        </w:rPr>
-      </w:pPr>
-      <w:r>
-        <w:rPr>
-          <w:rStyle w:val="HTMLCode"/>
-          <w:rFonts w:ascii="Times New Roman" w:hAnsi="Times New Roman" w:cs="Times New Roman"/>
-          <w:b/>
-          <w:bCs/>
-          <w:sz w:val="24"/>
-          <w:szCs w:val="24"/>
-        </w:rPr>
-        <w:t>6.</w:t>
-      </w:r>
-      <w:r>
-        <w:rPr>
-          <w:rStyle w:val="HTMLCode"/>
-          <w:rFonts w:ascii="Times New Roman" w:hAnsi="Times New Roman" w:cs="Times New Roman"/>
-          <w:b/>
-          <w:bCs/>
-          <w:sz w:val="24"/>
-          <w:szCs w:val="24"/>
-        </w:rPr>
-        <w:t>git stash clear</w:t>
-      </w:r>
-      <w:r>
-        <w:rPr>
-          <w:b/>
-          <w:bCs/>
-        </w:rPr>
-        <w:t>:</w:t>
+      </w:pPr>
+      <w:r>
+        <w:t>Sau đó nhập lệnh g++ ten_file.cpp -o ten_chuong_trinh</w:t>
       </w:r>
     </w:p>
     <w:p>
       <w:pPr>
         <w:pStyle w:val="NormalWeb"/>
       </w:pPr>
-      <w:proofErr w:type="spellStart"/>
-      <w:r>
-        <w:t>Xóa</w:t>
-      </w:r>
-      <w:proofErr w:type="spellEnd"/>
-      <w:r>
-        <w:t xml:space="preserve"> </w:t>
-      </w:r>
-      <w:proofErr w:type="spellStart"/>
-      <w:r>
-        <w:t>tất</w:t>
-      </w:r>
-      <w:proofErr w:type="spellEnd"/>
-      <w:r>
-        <w:t xml:space="preserve"> </w:t>
-      </w:r>
-      <w:proofErr w:type="spellStart"/>
-      <w:r>
-        <w:t>cả</w:t>
-      </w:r>
-      <w:proofErr w:type="spellEnd"/>
-      <w:r>
-        <w:t xml:space="preserve"> </w:t>
-      </w:r>
-      <w:proofErr w:type="spellStart"/>
-      <w:r>
-        <w:t>các</w:t>
-      </w:r>
-      <w:proofErr w:type="spellEnd"/>
-      <w:r>
-        <w:t xml:space="preserve"> stash </w:t>
-      </w:r>
-      <w:proofErr w:type="spellStart"/>
-      <w:r>
-        <w:t>trong</w:t>
-      </w:r>
-      <w:proofErr w:type="spellEnd"/>
-      <w:r>
-        <w:t xml:space="preserve"> </w:t>
-      </w:r>
-      <w:proofErr w:type="spellStart"/>
-      <w:r>
-        <w:t>danh</w:t>
-      </w:r>
-      <w:proofErr w:type="spellEnd"/>
-      <w:r>
-        <w:t xml:space="preserve"> </w:t>
-      </w:r>
-      <w:proofErr w:type="spellStart"/>
-      <w:r>
-        <w:t>sách</w:t>
-      </w:r>
-      <w:proofErr w:type="spellEnd"/>
-      <w:r>
-        <w:t xml:space="preserve">, </w:t>
-      </w:r>
-      <w:proofErr w:type="spellStart"/>
-      <w:r>
-        <w:t>giữ</w:t>
-      </w:r>
-      <w:proofErr w:type="spellEnd"/>
-      <w:r>
-        <w:t xml:space="preserve"> repository </w:t>
-      </w:r>
-      <w:proofErr w:type="spellStart"/>
-      <w:r>
-        <w:t>của</w:t>
-      </w:r>
-      <w:proofErr w:type="spellEnd"/>
-      <w:r>
-        <w:t xml:space="preserve"> </w:t>
-      </w:r>
-      <w:proofErr w:type="spellStart"/>
-      <w:r>
-        <w:t>bạn</w:t>
-      </w:r>
-      <w:proofErr w:type="spellEnd"/>
-      <w:r>
-        <w:t xml:space="preserve"> </w:t>
-      </w:r>
-      <w:proofErr w:type="spellStart"/>
-      <w:r>
-        <w:t>sạch</w:t>
-      </w:r>
-      <w:proofErr w:type="spellEnd"/>
-      <w:r>
-        <w:t xml:space="preserve"> </w:t>
-      </w:r>
-      <w:proofErr w:type="spellStart"/>
-      <w:r>
-        <w:t>sẽ</w:t>
-      </w:r>
-      <w:proofErr w:type="spellEnd"/>
-      <w:r>
-        <w:t xml:space="preserve"> </w:t>
-      </w:r>
-      <w:proofErr w:type="spellStart"/>
-      <w:r>
-        <w:t>và</w:t>
-      </w:r>
-      <w:proofErr w:type="spellEnd"/>
-      <w:r>
-        <w:t xml:space="preserve"> </w:t>
-      </w:r>
-      <w:proofErr w:type="spellStart"/>
-      <w:r>
-        <w:t>không</w:t>
-      </w:r>
-      <w:proofErr w:type="spellEnd"/>
-      <w:r>
-        <w:t xml:space="preserve"> </w:t>
-      </w:r>
-      <w:proofErr w:type="spellStart"/>
-      <w:r>
-        <w:t>có</w:t>
-      </w:r>
-      <w:proofErr w:type="spellEnd"/>
-      <w:r>
-        <w:t xml:space="preserve"> </w:t>
-      </w:r>
-      <w:proofErr w:type="spellStart"/>
-      <w:r>
-        <w:t>bất</w:t>
-      </w:r>
-      <w:proofErr w:type="spellEnd"/>
-      <w:r>
-        <w:t xml:space="preserve"> </w:t>
-      </w:r>
-      <w:proofErr w:type="spellStart"/>
-      <w:r>
-        <w:t>kỳ</w:t>
-      </w:r>
-      <w:proofErr w:type="spellEnd"/>
-      <w:r>
-        <w:t xml:space="preserve"> stash </w:t>
-      </w:r>
-      <w:proofErr w:type="spellStart"/>
-      <w:r>
-        <w:t>nào</w:t>
-      </w:r>
-      <w:proofErr w:type="spellEnd"/>
+      <w:proofErr w:type="gramStart"/>
+      <w:r>
+        <w:lastRenderedPageBreak/>
+        <w:t>./</w:t>
+      </w:r>
+      <w:proofErr w:type="gramEnd"/>
+      <w:r>
+        <w:t>ten_chuong_trinh</w:t>
+      </w:r>
+    </w:p>
+    <w:p>
+      <w:pPr>
+        <w:pStyle w:val="NormalWeb"/>
+      </w:pPr>
+      <w:r>
+        <w:t>-</w:t>
+      </w:r>
+      <w:r>
+        <w:t xml:space="preserve"> File sh: đơn giản hơn chỉ cần ./ten_file.sh</w:t>
+      </w:r>
     </w:p>
     <w:p>
       <w:pPr>
@@ -1724,6 +575,118 @@
 <file path=word/numbering.xml><?xml version="1.0" encoding="utf-8"?>
 <w:numbering xmlns:wpc="http://schemas.microsoft.com/office/word/2010/wordprocessingCanvas" xmlns:cx="http://schemas.microsoft.com/office/drawing/2014/chartex" xmlns:cx1="http://schemas.microsoft.com/office/drawing/2015/9/8/chartex" xmlns:cx2="http://schemas.microsoft.com/office/drawing/2015/10/21/chartex" xmlns:cx3="http://schemas.microsoft.com/office/drawing/2016/5/9/chartex" xmlns:cx4="http://schemas.microsoft.com/office/drawing/2016/5/10/chartex" xmlns:cx5="http://schemas.microsoft.com/office/drawing/2016/5/11/chartex" xmlns:cx6="http://schemas.microsoft.com/office/drawing/2016/5/12/chartex" xmlns:cx7="http://schemas.microsoft.com/office/drawing/2016/5/13/chartex" xmlns:cx8="http://schemas.microsoft.com/office/drawing/2016/5/14/chartex" xmlns:mc="http://schemas.openxmlformats.org/markup-compatibility/2006" xmlns:aink="http://schemas.microsoft.com/office/drawing/2016/ink" xmlns:am3d="http://schemas.microsoft.com/office/drawing/2017/model3d" xmlns:o="urn:schemas-microsoft-com:office:office" xmlns:oel="http://schemas.microsoft.com/office/2019/extlst" xmlns:r="http://schemas.openxmlformats.org/officeDocument/2006/relationships" xmlns:m="http://schemas.openxmlformats.org/officeDocument/2006/math" xmlns:v="urn:schemas-microsoft-com:vml" xmlns:wp14="http://schemas.microsoft.com/office/word/2010/wordprocessingDrawing" xmlns:wp="http://schemas.openxmlformats.org/drawingml/2006/wordprocessingDrawing" xmlns:w10="urn:schemas-microsoft-com:office:word" xmlns:w="http://schemas.openxmlformats.org/wordprocessingml/2006/main" xmlns:w14="http://schemas.microsoft.com/office/word/2010/wordml" xmlns:w15="http://schemas.microsoft.com/office/word/2012/wordml" xmlns:w16cex="http://schemas.microsoft.com/office/word/2018/wordml/cex" xmlns:w16cid="http://schemas.microsoft.com/office/word/2016/wordml/cid" xmlns:w16="http://schemas.microsoft.com/office/word/2018/wordml" xmlns:w16du="http://schemas.microsoft.com/office/word/2023/wordml/word16du" xmlns:w16sdtdh="http://schemas.microsoft.com/office/word/2020/wordml/sdtdatahash" xmlns:w16se="http://schemas.microsoft.com/office/word/2015/wordml/symex" xmlns:wpg="http://schemas.microsoft.com/office/word/2010/wordprocessingGroup" xmlns:wpi="http://schemas.microsoft.com/office/word/2010/wordprocessingInk" xmlns:wne="http://schemas.microsoft.com/office/word/2006/wordml" xmlns:wps="http://schemas.microsoft.com/office/word/2010/wordprocessingShape" mc:Ignorable="w14 w15 w16se w16cid w16 w16cex w16sdtdh wp14">
   <w:abstractNum w:abstractNumId="0" w15:restartNumberingAfterBreak="0">
+    <w:nsid w:val="263D21C0"/>
+    <w:multiLevelType w:val="hybridMultilevel"/>
+    <w:tmpl w:val="41ACB110"/>
+    <w:lvl w:ilvl="0" w:tplc="82DC925C">
+      <w:numFmt w:val="bullet"/>
+      <w:lvlText w:val="-"/>
+      <w:lvlJc w:val="left"/>
+      <w:pPr>
+        <w:ind w:left="720" w:hanging="360"/>
+      </w:pPr>
+      <w:rPr>
+        <w:rFonts w:ascii="Times New Roman" w:eastAsia="Times New Roman" w:hAnsi="Times New Roman" w:cs="Times New Roman" w:hint="default"/>
+      </w:rPr>
+    </w:lvl>
+    <w:lvl w:ilvl="1" w:tplc="04090003" w:tentative="1">
+      <w:start w:val="1"/>
+      <w:numFmt w:val="bullet"/>
+      <w:lvlText w:val="o"/>
+      <w:lvlJc w:val="left"/>
+      <w:pPr>
+        <w:ind w:left="1440" w:hanging="360"/>
+      </w:pPr>
+      <w:rPr>
+        <w:rFonts w:ascii="Courier New" w:hAnsi="Courier New" w:cs="Courier New" w:hint="default"/>
+      </w:rPr>
+    </w:lvl>
+    <w:lvl w:ilvl="2" w:tplc="04090005" w:tentative="1">
+      <w:start w:val="1"/>
+      <w:numFmt w:val="bullet"/>
+      <w:lvlText w:val=""/>
+      <w:lvlJc w:val="left"/>
+      <w:pPr>
+        <w:ind w:left="2160" w:hanging="360"/>
+      </w:pPr>
+      <w:rPr>
+        <w:rFonts w:ascii="Wingdings" w:hAnsi="Wingdings" w:hint="default"/>
+      </w:rPr>
+    </w:lvl>
+    <w:lvl w:ilvl="3" w:tplc="04090001" w:tentative="1">
+      <w:start w:val="1"/>
+      <w:numFmt w:val="bullet"/>
+      <w:lvlText w:val=""/>
+      <w:lvlJc w:val="left"/>
+      <w:pPr>
+        <w:ind w:left="2880" w:hanging="360"/>
+      </w:pPr>
+      <w:rPr>
+        <w:rFonts w:ascii="Symbol" w:hAnsi="Symbol" w:hint="default"/>
+      </w:rPr>
+    </w:lvl>
+    <w:lvl w:ilvl="4" w:tplc="04090003" w:tentative="1">
+      <w:start w:val="1"/>
+      <w:numFmt w:val="bullet"/>
+      <w:lvlText w:val="o"/>
+      <w:lvlJc w:val="left"/>
+      <w:pPr>
+        <w:ind w:left="3600" w:hanging="360"/>
+      </w:pPr>
+      <w:rPr>
+        <w:rFonts w:ascii="Courier New" w:hAnsi="Courier New" w:cs="Courier New" w:hint="default"/>
+      </w:rPr>
+    </w:lvl>
+    <w:lvl w:ilvl="5" w:tplc="04090005" w:tentative="1">
+      <w:start w:val="1"/>
+      <w:numFmt w:val="bullet"/>
+      <w:lvlText w:val=""/>
+      <w:lvlJc w:val="left"/>
+      <w:pPr>
+        <w:ind w:left="4320" w:hanging="360"/>
+      </w:pPr>
+      <w:rPr>
+        <w:rFonts w:ascii="Wingdings" w:hAnsi="Wingdings" w:hint="default"/>
+      </w:rPr>
+    </w:lvl>
+    <w:lvl w:ilvl="6" w:tplc="04090001" w:tentative="1">
+      <w:start w:val="1"/>
+      <w:numFmt w:val="bullet"/>
+      <w:lvlText w:val=""/>
+      <w:lvlJc w:val="left"/>
+      <w:pPr>
+        <w:ind w:left="5040" w:hanging="360"/>
+      </w:pPr>
+      <w:rPr>
+        <w:rFonts w:ascii="Symbol" w:hAnsi="Symbol" w:hint="default"/>
+      </w:rPr>
+    </w:lvl>
+    <w:lvl w:ilvl="7" w:tplc="04090003" w:tentative="1">
+      <w:start w:val="1"/>
+      <w:numFmt w:val="bullet"/>
+      <w:lvlText w:val="o"/>
+      <w:lvlJc w:val="left"/>
+      <w:pPr>
+        <w:ind w:left="5760" w:hanging="360"/>
+      </w:pPr>
+      <w:rPr>
+        <w:rFonts w:ascii="Courier New" w:hAnsi="Courier New" w:cs="Courier New" w:hint="default"/>
+      </w:rPr>
+    </w:lvl>
+    <w:lvl w:ilvl="8" w:tplc="04090005" w:tentative="1">
+      <w:start w:val="1"/>
+      <w:numFmt w:val="bullet"/>
+      <w:lvlText w:val=""/>
+      <w:lvlJc w:val="left"/>
+      <w:pPr>
+        <w:ind w:left="6480" w:hanging="360"/>
+      </w:pPr>
+      <w:rPr>
+        <w:rFonts w:ascii="Wingdings" w:hAnsi="Wingdings" w:hint="default"/>
+      </w:rPr>
+    </w:lvl>
+  </w:abstractNum>
+  <w:abstractNum w:abstractNumId="1" w15:restartNumberingAfterBreak="0">
     <w:nsid w:val="2F785226"/>
     <w:multiLevelType w:val="multilevel"/>
     <w:tmpl w:val="996C44B4"/>
@@ -1872,7 +835,7 @@
       </w:rPr>
     </w:lvl>
   </w:abstractNum>
-  <w:abstractNum w:abstractNumId="1" w15:restartNumberingAfterBreak="0">
+  <w:abstractNum w:abstractNumId="2" w15:restartNumberingAfterBreak="0">
     <w:nsid w:val="364A6DB1"/>
     <w:multiLevelType w:val="multilevel"/>
     <w:tmpl w:val="FFC4C0CC"/>
@@ -2017,7 +980,119 @@
       </w:rPr>
     </w:lvl>
   </w:abstractNum>
-  <w:abstractNum w:abstractNumId="2" w15:restartNumberingAfterBreak="0">
+  <w:abstractNum w:abstractNumId="3" w15:restartNumberingAfterBreak="0">
+    <w:nsid w:val="38886B27"/>
+    <w:multiLevelType w:val="hybridMultilevel"/>
+    <w:tmpl w:val="1CCE841A"/>
+    <w:lvl w:ilvl="0" w:tplc="AFBEA860">
+      <w:numFmt w:val="bullet"/>
+      <w:lvlText w:val="-"/>
+      <w:lvlJc w:val="left"/>
+      <w:pPr>
+        <w:ind w:left="720" w:hanging="360"/>
+      </w:pPr>
+      <w:rPr>
+        <w:rFonts w:ascii="Times New Roman" w:eastAsia="Times New Roman" w:hAnsi="Times New Roman" w:cs="Times New Roman" w:hint="default"/>
+      </w:rPr>
+    </w:lvl>
+    <w:lvl w:ilvl="1" w:tplc="04090003" w:tentative="1">
+      <w:start w:val="1"/>
+      <w:numFmt w:val="bullet"/>
+      <w:lvlText w:val="o"/>
+      <w:lvlJc w:val="left"/>
+      <w:pPr>
+        <w:ind w:left="1440" w:hanging="360"/>
+      </w:pPr>
+      <w:rPr>
+        <w:rFonts w:ascii="Courier New" w:hAnsi="Courier New" w:cs="Courier New" w:hint="default"/>
+      </w:rPr>
+    </w:lvl>
+    <w:lvl w:ilvl="2" w:tplc="04090005" w:tentative="1">
+      <w:start w:val="1"/>
+      <w:numFmt w:val="bullet"/>
+      <w:lvlText w:val=""/>
+      <w:lvlJc w:val="left"/>
+      <w:pPr>
+        <w:ind w:left="2160" w:hanging="360"/>
+      </w:pPr>
+      <w:rPr>
+        <w:rFonts w:ascii="Wingdings" w:hAnsi="Wingdings" w:hint="default"/>
+      </w:rPr>
+    </w:lvl>
+    <w:lvl w:ilvl="3" w:tplc="04090001" w:tentative="1">
+      <w:start w:val="1"/>
+      <w:numFmt w:val="bullet"/>
+      <w:lvlText w:val=""/>
+      <w:lvlJc w:val="left"/>
+      <w:pPr>
+        <w:ind w:left="2880" w:hanging="360"/>
+      </w:pPr>
+      <w:rPr>
+        <w:rFonts w:ascii="Symbol" w:hAnsi="Symbol" w:hint="default"/>
+      </w:rPr>
+    </w:lvl>
+    <w:lvl w:ilvl="4" w:tplc="04090003" w:tentative="1">
+      <w:start w:val="1"/>
+      <w:numFmt w:val="bullet"/>
+      <w:lvlText w:val="o"/>
+      <w:lvlJc w:val="left"/>
+      <w:pPr>
+        <w:ind w:left="3600" w:hanging="360"/>
+      </w:pPr>
+      <w:rPr>
+        <w:rFonts w:ascii="Courier New" w:hAnsi="Courier New" w:cs="Courier New" w:hint="default"/>
+      </w:rPr>
+    </w:lvl>
+    <w:lvl w:ilvl="5" w:tplc="04090005" w:tentative="1">
+      <w:start w:val="1"/>
+      <w:numFmt w:val="bullet"/>
+      <w:lvlText w:val=""/>
+      <w:lvlJc w:val="left"/>
+      <w:pPr>
+        <w:ind w:left="4320" w:hanging="360"/>
+      </w:pPr>
+      <w:rPr>
+        <w:rFonts w:ascii="Wingdings" w:hAnsi="Wingdings" w:hint="default"/>
+      </w:rPr>
+    </w:lvl>
+    <w:lvl w:ilvl="6" w:tplc="04090001" w:tentative="1">
+      <w:start w:val="1"/>
+      <w:numFmt w:val="bullet"/>
+      <w:lvlText w:val=""/>
+      <w:lvlJc w:val="left"/>
+      <w:pPr>
+        <w:ind w:left="5040" w:hanging="360"/>
+      </w:pPr>
+      <w:rPr>
+        <w:rFonts w:ascii="Symbol" w:hAnsi="Symbol" w:hint="default"/>
+      </w:rPr>
+    </w:lvl>
+    <w:lvl w:ilvl="7" w:tplc="04090003" w:tentative="1">
+      <w:start w:val="1"/>
+      <w:numFmt w:val="bullet"/>
+      <w:lvlText w:val="o"/>
+      <w:lvlJc w:val="left"/>
+      <w:pPr>
+        <w:ind w:left="5760" w:hanging="360"/>
+      </w:pPr>
+      <w:rPr>
+        <w:rFonts w:ascii="Courier New" w:hAnsi="Courier New" w:cs="Courier New" w:hint="default"/>
+      </w:rPr>
+    </w:lvl>
+    <w:lvl w:ilvl="8" w:tplc="04090005" w:tentative="1">
+      <w:start w:val="1"/>
+      <w:numFmt w:val="bullet"/>
+      <w:lvlText w:val=""/>
+      <w:lvlJc w:val="left"/>
+      <w:pPr>
+        <w:ind w:left="6480" w:hanging="360"/>
+      </w:pPr>
+      <w:rPr>
+        <w:rFonts w:ascii="Wingdings" w:hAnsi="Wingdings" w:hint="default"/>
+      </w:rPr>
+    </w:lvl>
+  </w:abstractNum>
+  <w:abstractNum w:abstractNumId="4" w15:restartNumberingAfterBreak="0">
     <w:nsid w:val="3A8F3FDC"/>
     <w:multiLevelType w:val="multilevel"/>
     <w:tmpl w:val="31923EA6"/>
@@ -2166,7 +1241,7 @@
       </w:rPr>
     </w:lvl>
   </w:abstractNum>
-  <w:abstractNum w:abstractNumId="3" w15:restartNumberingAfterBreak="0">
+  <w:abstractNum w:abstractNumId="5" w15:restartNumberingAfterBreak="0">
     <w:nsid w:val="57FA5A40"/>
     <w:multiLevelType w:val="multilevel"/>
     <w:tmpl w:val="336AB858"/>
@@ -2315,7 +1390,7 @@
       </w:rPr>
     </w:lvl>
   </w:abstractNum>
-  <w:abstractNum w:abstractNumId="4" w15:restartNumberingAfterBreak="0">
+  <w:abstractNum w:abstractNumId="6" w15:restartNumberingAfterBreak="0">
     <w:nsid w:val="62565024"/>
     <w:multiLevelType w:val="multilevel"/>
     <w:tmpl w:val="9C68A8FA"/>
@@ -2464,7 +1539,7 @@
       </w:rPr>
     </w:lvl>
   </w:abstractNum>
-  <w:abstractNum w:abstractNumId="5" w15:restartNumberingAfterBreak="0">
+  <w:abstractNum w:abstractNumId="7" w15:restartNumberingAfterBreak="0">
     <w:nsid w:val="70733649"/>
     <w:multiLevelType w:val="multilevel"/>
     <w:tmpl w:val="98D21A72"/>
@@ -2613,7 +1688,7 @@
       </w:rPr>
     </w:lvl>
   </w:abstractNum>
-  <w:abstractNum w:abstractNumId="6" w15:restartNumberingAfterBreak="0">
+  <w:abstractNum w:abstractNumId="8" w15:restartNumberingAfterBreak="0">
     <w:nsid w:val="7A4C0A6C"/>
     <w:multiLevelType w:val="multilevel"/>
     <w:tmpl w:val="E59E6346"/>
@@ -2763,25 +1838,31 @@
     </w:lvl>
   </w:abstractNum>
   <w:num w:numId="1" w16cid:durableId="619993010">
+    <w:abstractNumId w:val="5"/>
+  </w:num>
+  <w:num w:numId="2" w16cid:durableId="440493913">
+    <w:abstractNumId w:val="7"/>
+  </w:num>
+  <w:num w:numId="3" w16cid:durableId="123812750">
+    <w:abstractNumId w:val="8"/>
+  </w:num>
+  <w:num w:numId="4" w16cid:durableId="1871912041">
+    <w:abstractNumId w:val="6"/>
+  </w:num>
+  <w:num w:numId="5" w16cid:durableId="267278269">
+    <w:abstractNumId w:val="1"/>
+  </w:num>
+  <w:num w:numId="6" w16cid:durableId="1087729885">
+    <w:abstractNumId w:val="4"/>
+  </w:num>
+  <w:num w:numId="7" w16cid:durableId="314144449">
+    <w:abstractNumId w:val="2"/>
+  </w:num>
+  <w:num w:numId="8" w16cid:durableId="247812803">
     <w:abstractNumId w:val="3"/>
   </w:num>
-  <w:num w:numId="2" w16cid:durableId="440493913">
-    <w:abstractNumId w:val="5"/>
-  </w:num>
-  <w:num w:numId="3" w16cid:durableId="123812750">
-    <w:abstractNumId w:val="6"/>
-  </w:num>
-  <w:num w:numId="4" w16cid:durableId="1871912041">
-    <w:abstractNumId w:val="4"/>
-  </w:num>
-  <w:num w:numId="5" w16cid:durableId="267278269">
+  <w:num w:numId="9" w16cid:durableId="1846556933">
     <w:abstractNumId w:val="0"/>
-  </w:num>
-  <w:num w:numId="6" w16cid:durableId="1087729885">
-    <w:abstractNumId w:val="2"/>
-  </w:num>
-  <w:num w:numId="7" w16cid:durableId="314144449">
-    <w:abstractNumId w:val="1"/>
   </w:num>
 </w:numbering>
 </file>

</xml_diff>